<commit_message>
Fix OCR for live server
</commit_message>
<xml_diff>
--- a/generated_letters/KA03LA7704_Scrap_Letter.docx
+++ b/generated_letters/KA03LA7704_Scrap_Letter.docx
@@ -25,34 +25,9 @@
         </w:rPr>
       </w:pPr>
       <w:r>
-        <w:rPr>
-          <w:rFonts w:ascii="Arial MT"/>
-          <w:spacing w:val="-5"/>
-        </w:rPr>
         <w:t>To,</w:t>
         <w:tab/>
         <w:t xml:space="preserve">Date:  </w:t>
-      </w:r>
-      <w:r>
-        <w:rPr>
-          <w:rFonts w:ascii="Arial MT"/>
-        </w:rPr>
-      </w:r>
-      <w:r>
-        <w:rPr>
-          <w:rFonts w:ascii="Arial MT"/>
-          <w:spacing w:val="4"/>
-        </w:rPr>
-      </w:r>
-      <w:r>
-        <w:rPr>
-          <w:rFonts w:ascii="Arial MT" w:hAnsi="Arial MT"/>
-        </w:rPr>
-      </w:r>
-      <w:r>
-        <w:rPr>
-          <w:rFonts w:ascii="Arial MT"/>
-        </w:rPr>
       </w:r>
     </w:p>
     <w:p>
@@ -66,21 +41,7 @@
         </w:rPr>
       </w:pPr>
       <w:r>
-        <w:rPr>
-          <w:rFonts w:ascii="Arial MT"/>
-        </w:rPr>
         <w:t xml:space="preserve">                                                                                                                              City: </w:t>
-      </w:r>
-      <w:r>
-        <w:rPr>
-          <w:rFonts w:ascii="Arial MT"/>
-          <w:spacing w:val="-6"/>
-        </w:rPr>
-      </w:r>
-      <w:r>
-        <w:rPr>
-          <w:rFonts w:ascii="Arial MT" w:hAnsi="Arial MT"/>
-        </w:rPr>
       </w:r>
     </w:p>
     <w:p>
@@ -94,58 +55,9 @@
         </w:rPr>
       </w:pPr>
       <w:r>
-        <w:rPr>
-          <w:rFonts w:ascii="Arial MT" w:hAnsi="Arial MT"/>
-        </w:rPr>
         <w:t xml:space="preserve">      Owner Name -</w:t>
         <w:tab/>
         <w:t xml:space="preserve">                       </w:t>
-      </w:r>
-      <w:r>
-        <w:rPr>
-          <w:rFonts w:ascii="Arial MT" w:hAnsi="Arial MT"/>
-        </w:rPr>
-      </w:r>
-      <w:r>
-        <w:rPr>
-          <w:rFonts w:ascii="Arial MT"/>
-        </w:rPr>
-      </w:r>
-      <w:r>
-        <w:rPr>
-          <w:rFonts w:ascii="Arial MT"/>
-        </w:rPr>
-      </w:r>
-      <w:r>
-        <w:rPr>
-          <w:rFonts w:ascii="Arial MT"/>
-          <w:spacing w:val="-2"/>
-        </w:rPr>
-      </w:r>
-      <w:r>
-        <w:rPr>
-          <w:rFonts w:ascii="Arial MT"/>
-          <w:spacing w:val="-2"/>
-        </w:rPr>
-      </w:r>
-      <w:proofErr w:type="spellStart"/>
-      <w:r>
-        <w:rPr>
-          <w:rFonts w:ascii="Arial MT"/>
-          <w:spacing w:val="-2"/>
-        </w:rPr>
-      </w:r>
-      <w:proofErr w:type="spellEnd"/>
-      <w:r>
-        <w:rPr>
-          <w:rFonts w:ascii="Arial MT"/>
-          <w:spacing w:val="-2"/>
-        </w:rPr>
-      </w:r>
-      <w:r>
-        <w:rPr>
-          <w:rFonts w:ascii="Arial MT"/>
-        </w:rPr>
       </w:r>
     </w:p>
     <w:p>
@@ -161,71 +73,7 @@
         </w:rPr>
       </w:pPr>
       <w:r>
-        <w:rPr>
-          <w:rFonts w:ascii="Arial MT" w:hAnsi="Arial MT"/>
-        </w:rPr>
-        <w:t>Make &amp; Model – TVS JUPITER 125 OWNERNANE</w:t>
-      </w:r>
-      <w:r>
-        <w:rPr>
-          <w:rFonts w:ascii="Arial MT" w:hAnsi="Arial MT"/>
-          <w:spacing w:val="-8"/>
-        </w:rPr>
-      </w:r>
-      <w:r>
-        <w:rPr>
-          <w:rFonts w:ascii="Arial MT" w:hAnsi="Arial MT"/>
-        </w:rPr>
-      </w:r>
-      <w:r>
-        <w:rPr>
-          <w:rFonts w:ascii="Arial MT" w:hAnsi="Arial MT"/>
-          <w:spacing w:val="-8"/>
-        </w:rPr>
-      </w:r>
-      <w:proofErr w:type="gramStart"/>
-      <w:r>
-        <w:rPr>
-          <w:rFonts w:ascii="Arial MT" w:hAnsi="Arial MT"/>
-        </w:rPr>
-      </w:r>
-      <w:proofErr w:type="gramEnd"/>
-      <w:r>
-        <w:rPr>
-          <w:rFonts w:ascii="Arial MT" w:hAnsi="Arial MT"/>
-          <w:spacing w:val="-8"/>
-        </w:rPr>
-      </w:r>
-      <w:r>
-        <w:rPr>
-          <w:rFonts w:ascii="Arial MT" w:hAnsi="Arial MT"/>
-        </w:rPr>
-      </w:r>
-      <w:r>
-        <w:rPr>
-          <w:rFonts w:ascii="Arial MT" w:hAnsi="Arial MT"/>
-          <w:spacing w:val="40"/>
-        </w:rPr>
-      </w:r>
-      <w:r>
-        <w:rPr>
-          <w:rFonts w:ascii="Arial MT"/>
-          <w:spacing w:val="-2"/>
-        </w:rPr>
-      </w:r>
-      <w:proofErr w:type="spellStart"/>
-      <w:r>
-        <w:rPr>
-          <w:rFonts w:ascii="Arial MT"/>
-          <w:spacing w:val="-2"/>
-        </w:rPr>
-      </w:r>
-      <w:proofErr w:type="spellEnd"/>
-      <w:r>
-        <w:rPr>
-          <w:rFonts w:ascii="Arial MT"/>
-          <w:spacing w:val="-2"/>
-        </w:rPr>
+        <w:t>Make &amp; Model – TVS JUPITER 125</w:t>
       </w:r>
     </w:p>
     <w:p>
@@ -242,30 +90,7 @@
         </w:rPr>
       </w:pPr>
       <w:r>
-        <w:rPr>
-          <w:rFonts w:ascii="Arial MT" w:hAnsi="Arial MT"/>
-        </w:rPr>
         <w:t>Registration No – KA03LA7704</w:t>
-      </w:r>
-      <w:r>
-        <w:rPr>
-          <w:rFonts w:ascii="Arial MT"/>
-          <w:spacing w:val="-2"/>
-        </w:rPr>
-      </w:r>
-      <w:proofErr w:type="spellStart"/>
-      <w:r>
-        <w:rPr>
-          <w:rFonts w:ascii="Arial MT"/>
-          <w:spacing w:val="-2"/>
-        </w:rPr>
-      </w:r>
-      <w:proofErr w:type="spellEnd"/>
-      <w:r>
-        <w:rPr>
-          <w:rFonts w:ascii="Arial MT"/>
-          <w:spacing w:val="-2"/>
-        </w:rPr>
       </w:r>
     </w:p>
     <w:p>
@@ -282,30 +107,7 @@
         </w:rPr>
       </w:pPr>
       <w:r>
-        <w:rPr>
-          <w:rFonts w:ascii="Arial MT" w:hAnsi="Arial MT"/>
-        </w:rPr>
         <w:t>Chassis No – MD626AK42R1P00034</w:t>
-      </w:r>
-      <w:r>
-        <w:rPr>
-          <w:rFonts w:ascii="Arial MT"/>
-          <w:spacing w:val="-2"/>
-        </w:rPr>
-      </w:r>
-      <w:proofErr w:type="spellStart"/>
-      <w:r>
-        <w:rPr>
-          <w:rFonts w:ascii="Arial MT"/>
-          <w:spacing w:val="-2"/>
-        </w:rPr>
-      </w:r>
-      <w:proofErr w:type="spellEnd"/>
-      <w:r>
-        <w:rPr>
-          <w:rFonts w:ascii="Arial MT"/>
-          <w:spacing w:val="-2"/>
-        </w:rPr>
       </w:r>
     </w:p>
     <w:p>
@@ -322,30 +124,7 @@
         </w:rPr>
       </w:pPr>
       <w:r>
-        <w:rPr>
-          <w:rFonts w:ascii="Arial MT" w:hAnsi="Arial MT"/>
-        </w:rPr>
         <w:t xml:space="preserve"> Engine No – BK4NR1516937</w:t>
-      </w:r>
-      <w:r>
-        <w:rPr>
-          <w:rFonts w:ascii="Arial MT"/>
-          <w:spacing w:val="-2"/>
-        </w:rPr>
-      </w:r>
-      <w:proofErr w:type="spellStart"/>
-      <w:r>
-        <w:rPr>
-          <w:rFonts w:ascii="Arial MT"/>
-          <w:spacing w:val="-2"/>
-        </w:rPr>
-      </w:r>
-      <w:proofErr w:type="spellEnd"/>
-      <w:r>
-        <w:rPr>
-          <w:rFonts w:ascii="Arial MT"/>
-          <w:spacing w:val="-2"/>
-        </w:rPr>
       </w:r>
     </w:p>
     <w:p>
@@ -358,27 +137,7 @@
         </w:rPr>
       </w:pPr>
       <w:r>
-        <w:rPr>
-          <w:rFonts w:ascii="Arial MT" w:hAnsi="Arial MT"/>
-        </w:rPr>
         <w:t xml:space="preserve"> SIPL: </w:t>
-      </w:r>
-      <w:r>
-        <w:rPr>
-          <w:rFonts w:ascii="Arial MT" w:hAnsi="Arial MT"/>
-        </w:rPr>
-      </w:r>
-      <w:proofErr w:type="spellStart"/>
-      <w:r>
-        <w:rPr>
-          <w:rFonts w:ascii="Arial MT" w:hAnsi="Arial MT"/>
-        </w:rPr>
-      </w:r>
-      <w:proofErr w:type="spellEnd"/>
-      <w:r>
-        <w:rPr>
-          <w:rFonts w:ascii="Arial MT" w:hAnsi="Arial MT"/>
-        </w:rPr>
       </w:r>
     </w:p>
     <w:p>
@@ -391,66 +150,7 @@
         </w:rPr>
       </w:pPr>
       <w:r>
-        <w:rPr>
-          <w:rFonts w:ascii="Arial MT" w:hAnsi="Arial MT"/>
-        </w:rPr>
         <w:t xml:space="preserve">      Handed over by – </w:t>
-      </w:r>
-      <w:r>
-        <w:rPr>
-          <w:rFonts w:ascii="Arial MT" w:hAnsi="Arial MT"/>
-          <w:spacing w:val="-10"/>
-        </w:rPr>
-      </w:r>
-      <w:r>
-        <w:rPr>
-          <w:rFonts w:ascii="Arial MT" w:hAnsi="Arial MT"/>
-        </w:rPr>
-      </w:r>
-      <w:r>
-        <w:rPr>
-          <w:rFonts w:ascii="Arial MT" w:hAnsi="Arial MT"/>
-          <w:spacing w:val="-9"/>
-        </w:rPr>
-      </w:r>
-      <w:r>
-        <w:rPr>
-          <w:rFonts w:ascii="Arial MT" w:hAnsi="Arial MT"/>
-        </w:rPr>
-      </w:r>
-      <w:r>
-        <w:rPr>
-          <w:rFonts w:ascii="Arial MT" w:hAnsi="Arial MT"/>
-          <w:spacing w:val="-11"/>
-        </w:rPr>
-      </w:r>
-      <w:r>
-        <w:rPr>
-          <w:rFonts w:ascii="Arial MT" w:hAnsi="Arial MT"/>
-        </w:rPr>
-      </w:r>
-      <w:r>
-        <w:rPr>
-          <w:rFonts w:ascii="Arial MT" w:hAnsi="Arial MT"/>
-          <w:spacing w:val="-10"/>
-        </w:rPr>
-      </w:r>
-      <w:r>
-        <w:rPr>
-          <w:rFonts w:ascii="Arial MT" w:hAnsi="Arial MT"/>
-        </w:rPr>
-      </w:r>
-      <w:proofErr w:type="spellStart"/>
-      <w:r>
-        <w:rPr>
-          <w:rFonts w:ascii="Arial MT" w:hAnsi="Arial MT"/>
-        </w:rPr>
-      </w:r>
-      <w:proofErr w:type="spellEnd"/>
-      <w:r>
-        <w:rPr>
-          <w:rFonts w:ascii="Arial MT" w:hAnsi="Arial MT"/>
-        </w:rPr>
       </w:r>
     </w:p>
     <w:p>
@@ -463,66 +163,7 @@
         </w:rPr>
       </w:pPr>
       <w:r>
-        <w:rPr>
-          <w:rFonts w:ascii="Arial MT" w:hAnsi="Arial MT"/>
-        </w:rPr>
         <w:t xml:space="preserve">Pick Up Address – </w:t>
-      </w:r>
-      <w:r>
-        <w:rPr>
-          <w:rFonts w:ascii="Arial MT" w:hAnsi="Arial MT"/>
-          <w:spacing w:val="-4"/>
-        </w:rPr>
-      </w:r>
-      <w:r>
-        <w:rPr>
-          <w:rFonts w:ascii="Arial MT" w:hAnsi="Arial MT"/>
-        </w:rPr>
-      </w:r>
-      <w:r>
-        <w:rPr>
-          <w:rFonts w:ascii="Arial MT" w:hAnsi="Arial MT"/>
-          <w:spacing w:val="-3"/>
-        </w:rPr>
-      </w:r>
-      <w:r>
-        <w:rPr>
-          <w:rFonts w:ascii="Arial MT" w:hAnsi="Arial MT"/>
-        </w:rPr>
-      </w:r>
-      <w:r>
-        <w:rPr>
-          <w:rFonts w:ascii="Arial MT" w:hAnsi="Arial MT"/>
-          <w:spacing w:val="-2"/>
-        </w:rPr>
-      </w:r>
-      <w:r>
-        <w:rPr>
-          <w:rFonts w:ascii="Arial MT" w:hAnsi="Arial MT"/>
-        </w:rPr>
-      </w:r>
-      <w:r>
-        <w:rPr>
-          <w:rFonts w:ascii="Arial MT" w:hAnsi="Arial MT"/>
-          <w:spacing w:val="-4"/>
-        </w:rPr>
-      </w:r>
-      <w:r>
-        <w:rPr>
-          <w:rFonts w:ascii="Arial MT" w:hAnsi="Arial MT"/>
-        </w:rPr>
-      </w:r>
-      <w:proofErr w:type="spellStart"/>
-      <w:r>
-        <w:rPr>
-          <w:rFonts w:ascii="Arial MT" w:hAnsi="Arial MT"/>
-        </w:rPr>
-      </w:r>
-      <w:proofErr w:type="spellEnd"/>
-      <w:r>
-        <w:rPr>
-          <w:rFonts w:ascii="Arial MT" w:hAnsi="Arial MT"/>
-        </w:rPr>
       </w:r>
     </w:p>
     <w:p>

</xml_diff>